<commit_message>
Update Living Syllabus spec to draft v0.2
Session rhythm with one-tap topic push and post-class quick quiz,
who-sees-what visibility rules, teacher effort budget, and links to
the living-syllabus repo, backlog, and engineering/UX docs.

Co-Authored-By: Claude Fable 5 <noreply@anthropic.com>
</commit_message>
<xml_diff>
--- a/docs/Living-Syllabus-Spec.docx
+++ b/docs/Living-Syllabus-Spec.docx
@@ -15,7 +15,7 @@
           <w:sz w:val="17"/>
           <w:szCs w:val="17"/>
         </w:rPr>
-        <w:t xml:space="preserve">PRODUCT SPEC · DRAFT v0.1</w:t>
+        <w:t xml:space="preserve">PRODUCT SPEC · DRAFT v0.2</w:t>
       </w:r>
     </w:p>
     <w:p>
@@ -68,20 +68,20 @@
       </w:r>
       <w:r>
         <w:rPr>
-          <w:rFonts w:ascii="Arial" w:cs="Arial" w:eastAsia="Arial" w:hAnsi="Arial"/>
-          <w:color w:val="6E6580"/>
-          <w:sz w:val="17"/>
-          <w:szCs w:val="17"/>
-        </w:rPr>
-        <w:t xml:space="preserve">Working name, open for review    </w:t>
-      </w:r>
-      <w:r>
-        <w:rPr>
           <w:rFonts w:ascii="Consolas" w:cs="Consolas" w:eastAsia="Consolas" w:hAnsi="Consolas"/>
           <w:color w:val="6B21A8"/>
           <w:sz w:val="16"/>
           <w:szCs w:val="16"/>
         </w:rPr>
+        <w:t xml:space="preserve">github.com/deepusnath/living-syllabus    </w:t>
+      </w:r>
+      <w:r>
+        <w:rPr>
+          <w:rFonts w:ascii="Consolas" w:cs="Consolas" w:eastAsia="Consolas" w:hAnsi="Consolas"/>
+          <w:color w:val="6B21A8"/>
+          <w:sz w:val="16"/>
+          <w:szCs w:val="16"/>
+        </w:rPr>
         <w:t xml:space="preserve">github.com/The-Purple-Movement/WikiSyllabus</w:t>
       </w:r>
     </w:p>
@@ -122,7 +122,7 @@
         <w:pStyle w:val="Heading1"/>
       </w:pPr>
       <w:r>
-        <w:t xml:space="preserve">The loop</w:t>
+        <w:t xml:space="preserve">The session rhythm</w:t>
       </w:r>
     </w:p>
     <w:p>
@@ -139,10 +139,10 @@
           <w:b/>
           <w:bCs/>
         </w:rPr>
-        <w:t xml:space="preserve">Night before — </w:t>
-      </w:r>
-      <w:r>
-        <w:t xml:space="preserve">the timetable triggers a bounded 10-minute session on tomorrow's specific module. The AI teaches, then interrogates. Output: the 2–3 questions the student genuinely cannot answer.</w:t>
+        <w:t xml:space="preserve">Push — </w:t>
+      </w:r>
+      <w:r>
+        <w:t xml:space="preserve">the teacher shares the next topic in one tap; the app suggests the next module from the real syllabus. The teacher is the scheduler — no timetable integration needed, and a pushed topic is a small public promise about what the next class covers.</w:t>
       </w:r>
     </w:p>
     <w:p>
@@ -159,10 +159,10 @@
           <w:b/>
           <w:bCs/>
         </w:rPr>
-        <w:t xml:space="preserve">Before class — </w:t>
-      </w:r>
-      <w:r>
-        <w:t xml:space="preserve">the teacher opens the confusion map: what the class understood, what confused them, the top question clusters.</w:t>
+        <w:t xml:space="preserve">Brief — </w:t>
+      </w:r>
+      <w:r>
+        <w:t xml:space="preserve">each student runs a bounded ~10-minute Socratic session the night before. It ends by distilling the 2–3 questions the student genuinely cannot answer, ranked by “your teacher can answer this better than I can.”</w:t>
       </w:r>
     </w:p>
     <w:p>
@@ -179,10 +179,10 @@
           <w:b/>
           <w:bCs/>
         </w:rPr>
-        <w:t xml:space="preserve">In class — </w:t>
-      </w:r>
-      <w:r>
-        <w:t xml:space="preserve">the lecture shrinks; the questions get asked; the teacher teaches to the room's actual gaps.</w:t>
+        <w:t xml:space="preserve">Map — </w:t>
+      </w:r>
+      <w:r>
+        <w:t xml:space="preserve">before class, the teacher opens the confusion map, plus a prep brief: engagement strategies for this topic, informed by what confused previous cohorts.</w:t>
       </w:r>
     </w:p>
     <w:p>
@@ -199,30 +199,70 @@
           <w:b/>
           <w:bCs/>
         </w:rPr>
-        <w:t xml:space="preserve">After class — </w:t>
-      </w:r>
-      <w:r>
-        <w:t xml:space="preserve">a 60-second capture: which questions got answered, which didn't. That record feeds the living layer.</w:t>
-      </w:r>
-    </w:p>
-    <w:p>
-      <w:pPr>
-        <w:spacing w:after="120"/>
-      </w:pPr>
-    </w:p>
-    <w:p>
-      <w:pPr>
-        <w:spacing w:after="160"/>
+        <w:t xml:space="preserve">Class — </w:t>
+      </w:r>
+      <w:r>
+        <w:t xml:space="preserve">the lecture shrinks; the claimed questions get asked; the teacher teaches to the room's actual gaps.</w:t>
+      </w:r>
+    </w:p>
+    <w:p>
+      <w:pPr>
+        <w:pStyle w:val="ListParagraph"/>
+        <w:numPr>
+          <w:ilvl w:val="0"/>
+          <w:numId w:val="2"/>
+        </w:numPr>
+        <w:spacing w:after="100"/>
       </w:pPr>
       <w:r>
         <w:rPr>
           <w:b/>
           <w:bCs/>
         </w:rPr>
-        <w:t xml:space="preserve">Data flow: </w:t>
-      </w:r>
-      <w:r>
-        <w:t xml:space="preserve">syllabus file → pre-class brief → student questions + confusion map → classroom → answered/unanswered capture → living layer → back into the commons, improving the next classroom's brief.</w:t>
+        <w:t xml:space="preserve">Quiz — </w:t>
+      </w:r>
+      <w:r>
+        <w:t xml:space="preserve">one tap fires ~5 ungraded questions generated from the module's areas and the confusion clusters that surfaced — so it measures whether the discussion actually resolved the confusion. Default: last five minutes of class; morning-after delivery is a planned experiment (spaced retrieval).</w:t>
+      </w:r>
+    </w:p>
+    <w:p>
+      <w:pPr>
+        <w:pStyle w:val="ListParagraph"/>
+        <w:numPr>
+          <w:ilvl w:val="0"/>
+          <w:numId w:val="2"/>
+        </w:numPr>
+        <w:spacing w:after="100"/>
+      </w:pPr>
+      <w:r>
+        <w:rPr>
+          <w:b/>
+          <w:bCs/>
+        </w:rPr>
+        <w:t xml:space="preserve">Clear-up — </w:t>
+      </w:r>
+      <w:r>
+        <w:t xml:space="preserve">unresolved areas open the next session as a five-minute clear-up before the next push. Nothing carries forward silently.</w:t>
+      </w:r>
+    </w:p>
+    <w:p>
+      <w:pPr>
+        <w:pBdr>
+          <w:left w:val="single" w:color="6B21A8" w:sz="24" w:space="4"/>
+        </w:pBdr>
+        <w:shd w:fill="F1EAF9" w:val="clear"/>
+        <w:spacing w:after="200" w:before="80"/>
+        <w:ind w:left="200"/>
+      </w:pPr>
+      <w:r>
+        <w:rPr>
+          <w:b/>
+          <w:bCs/>
+        </w:rPr>
+        <w:t xml:space="preserve">Teacher effort budget: ≤3 minutes outside class. </w:t>
+      </w:r>
+      <w:r>
+        <w:t xml:space="preserve">Push is one tap. Quiz is one tap with optional per-question veto. The map reads in under 30 seconds. Any teacher-facing feature that exceeds this budget does not ship.</w:t>
       </w:r>
     </w:p>
     <w:p>
@@ -255,7 +295,7 @@
         <w:spacing w:after="160"/>
       </w:pPr>
       <w:r>
-        <w:t xml:space="preserve">A bounded session, not an open chat box. Scoped to one module of the student's real syllabus, pulled from WikiSyllabus by university → branch → semester. Socratic by default: it asks more than it answers, and it ends by distilling questions ranked by “your teacher can answer this better than I can.” The output is something the student carries into a room with a human in it.</w:t>
+        <w:t xml:space="preserve">A bounded session, not an open chat box. Scoped to one module of the student's real syllabus, pulled from WikiSyllabus by university → branch → semester. The output is something the student carries into a room with a human in it. After class, the same surface delivers the quiz and the student's private results.</w:t>
       </w:r>
     </w:p>
     <w:p>
@@ -272,7 +312,7 @@
         <w:t xml:space="preserve">TEACHER  ·  </w:t>
       </w:r>
       <w:r>
-        <w:t xml:space="preserve">The confusion map</w:t>
+        <w:t xml:space="preserve">The console</w:t>
       </w:r>
     </w:p>
     <w:p>
@@ -280,7 +320,7 @@
         <w:spacing w:after="160"/>
       </w:pPr>
       <w:r>
-        <w:t xml:space="preserve">Before walking in: “31 of 47 engaged. Sliding windows understood; congestion control confused most of the class. Top 6 questions, clustered.” This is the one thing no general AI offers, and the reason a teacher distributes the product to 60 students in a single decision. Aggregate only — never individual transcripts.</w:t>
+        <w:t xml:space="preserve">Push, prep brief, confusion map, quiz trigger, clear-up card. Before walking in: “31 of 47 engaged. Sliding windows understood; congestion control confused most of the class. Top 6 questions, clustered.” The confusion map is the one thing no general AI offers, and the reason a teacher distributes the product to 60 students in a single decision.</w:t>
       </w:r>
     </w:p>
     <w:p>
@@ -305,7 +345,7 @@
         <w:spacing w:after="160"/>
       </w:pPr>
       <w:r>
-        <w:t xml:space="preserve">Every session is keyed to a WikiSyllabus file path and module. Data aggregates across every classroom teaching the same course: real question banks, recurring misconceptions, questions classrooms consistently fail to answer, and staleness deltas versus industry practice. Written back to the commons as forkable YAML via moderated automated PRs. A teacher at college #41 inherits the misconception map from the forty classrooms before them.</w:t>
+        <w:t xml:space="preserve">Every session is keyed to a WikiSyllabus file path and module. Data aggregates across every classroom teaching the same course: real question banks, recurring misconceptions, questions classrooms consistently fail to answer, quiz-measured resolution rates, and staleness deltas versus industry practice. Written back to the commons as forkable YAML via moderated automated PRs. A teacher at college #41 inherits the misconception map from the forty classrooms before them.</w:t>
       </w:r>
     </w:p>
     <w:p>
@@ -333,6 +373,819 @@
         <w:pStyle w:val="Heading1"/>
       </w:pPr>
       <w:r>
+        <w:t xml:space="preserve">Who sees what</w:t>
+      </w:r>
+    </w:p>
+    <w:p>
+      <w:pPr>
+        <w:spacing w:after="160"/>
+      </w:pPr>
+      <w:r>
+        <w:t xml:space="preserve">The governing principle: </w:t>
+      </w:r>
+      <w:r>
+        <w:rPr>
+          <w:b/>
+          <w:bCs/>
+        </w:rPr>
+        <w:t xml:space="preserve">contribution is visible, struggle is private. </w:t>
+      </w:r>
+      <w:r>
+        <w:t xml:space="preserve">A question is a contribution — a name can go on it, by choice, at the moment it's picked for class. Confusion is a state — it is never individual.</w:t>
+      </w:r>
+    </w:p>
+    <w:tbl>
+      <w:tblPr>
+        <w:tblW w:type="dxa" w:w="9360"/>
+        <w:tblBorders>
+          <w:top w:val="single" w:color="auto" w:sz="4"/>
+          <w:left w:val="single" w:color="auto" w:sz="4"/>
+          <w:bottom w:val="single" w:color="auto" w:sz="4"/>
+          <w:right w:val="single" w:color="auto" w:sz="4"/>
+          <w:insideH w:val="single" w:color="auto" w:sz="4"/>
+          <w:insideV w:val="single" w:color="auto" w:sz="4"/>
+        </w:tblBorders>
+      </w:tblPr>
+      <w:tblGrid>
+        <w:gridCol w:w="2200"/>
+        <w:gridCol w:w="2300"/>
+        <w:gridCol w:w="2760"/>
+        <w:gridCol w:w="2100"/>
+      </w:tblGrid>
+      <w:tr>
+        <w:tc>
+          <w:tcPr>
+            <w:tcW w:type="dxa" w:w="2200"/>
+            <w:tcBorders>
+              <w:top w:val="single" w:color="E5E0EE" w:sz="4"/>
+              <w:left w:val="single" w:color="E5E0EE" w:sz="4"/>
+              <w:bottom w:val="single" w:color="E5E0EE" w:sz="4"/>
+              <w:right w:val="single" w:color="E5E0EE" w:sz="4"/>
+            </w:tcBorders>
+            <w:shd w:fill="F1EAF9" w:val="clear"/>
+            <w:tcMar>
+              <w:top w:type="dxa" w:w="80"/>
+              <w:left w:type="dxa" w:w="100"/>
+              <w:bottom w:type="dxa" w:w="80"/>
+              <w:right w:type="dxa" w:w="100"/>
+            </w:tcMar>
+          </w:tcPr>
+          <w:p>
+            <w:pPr>
+              <w:spacing w:after="0"/>
+            </w:pPr>
+            <w:r>
+              <w:rPr>
+                <w:rFonts w:ascii="Arial" w:cs="Arial" w:eastAsia="Arial" w:hAnsi="Arial"/>
+                <w:b/>
+                <w:bCs/>
+                <w:color w:val="6B21A8"/>
+                <w:sz w:val="15"/>
+                <w:szCs w:val="15"/>
+              </w:rPr>
+              <w:t xml:space="preserve">DATA</w:t>
+            </w:r>
+          </w:p>
+        </w:tc>
+        <w:tc>
+          <w:tcPr>
+            <w:tcW w:type="dxa" w:w="2300"/>
+            <w:tcBorders>
+              <w:top w:val="single" w:color="E5E0EE" w:sz="4"/>
+              <w:left w:val="single" w:color="E5E0EE" w:sz="4"/>
+              <w:bottom w:val="single" w:color="E5E0EE" w:sz="4"/>
+              <w:right w:val="single" w:color="E5E0EE" w:sz="4"/>
+            </w:tcBorders>
+            <w:shd w:fill="F1EAF9" w:val="clear"/>
+            <w:tcMar>
+              <w:top w:type="dxa" w:w="80"/>
+              <w:left w:type="dxa" w:w="100"/>
+              <w:bottom w:type="dxa" w:w="80"/>
+              <w:right w:type="dxa" w:w="100"/>
+            </w:tcMar>
+          </w:tcPr>
+          <w:p>
+            <w:pPr>
+              <w:spacing w:after="0"/>
+            </w:pPr>
+            <w:r>
+              <w:rPr>
+                <w:rFonts w:ascii="Arial" w:cs="Arial" w:eastAsia="Arial" w:hAnsi="Arial"/>
+                <w:b/>
+                <w:bCs/>
+                <w:color w:val="6B21A8"/>
+                <w:sz w:val="15"/>
+                <w:szCs w:val="15"/>
+              </w:rPr>
+              <w:t xml:space="preserve">STUDENT SEES</w:t>
+            </w:r>
+          </w:p>
+        </w:tc>
+        <w:tc>
+          <w:tcPr>
+            <w:tcW w:type="dxa" w:w="2760"/>
+            <w:tcBorders>
+              <w:top w:val="single" w:color="E5E0EE" w:sz="4"/>
+              <w:left w:val="single" w:color="E5E0EE" w:sz="4"/>
+              <w:bottom w:val="single" w:color="E5E0EE" w:sz="4"/>
+              <w:right w:val="single" w:color="E5E0EE" w:sz="4"/>
+            </w:tcBorders>
+            <w:shd w:fill="F1EAF9" w:val="clear"/>
+            <w:tcMar>
+              <w:top w:type="dxa" w:w="80"/>
+              <w:left w:type="dxa" w:w="100"/>
+              <w:bottom w:type="dxa" w:w="80"/>
+              <w:right w:type="dxa" w:w="100"/>
+            </w:tcMar>
+          </w:tcPr>
+          <w:p>
+            <w:pPr>
+              <w:spacing w:after="0"/>
+            </w:pPr>
+            <w:r>
+              <w:rPr>
+                <w:rFonts w:ascii="Arial" w:cs="Arial" w:eastAsia="Arial" w:hAnsi="Arial"/>
+                <w:b/>
+                <w:bCs/>
+                <w:color w:val="6B21A8"/>
+                <w:sz w:val="15"/>
+                <w:szCs w:val="15"/>
+              </w:rPr>
+              <w:t xml:space="preserve">TEACHER SEES</w:t>
+            </w:r>
+          </w:p>
+        </w:tc>
+        <w:tc>
+          <w:tcPr>
+            <w:tcW w:type="dxa" w:w="2100"/>
+            <w:tcBorders>
+              <w:top w:val="single" w:color="E5E0EE" w:sz="4"/>
+              <w:left w:val="single" w:color="E5E0EE" w:sz="4"/>
+              <w:bottom w:val="single" w:color="E5E0EE" w:sz="4"/>
+              <w:right w:val="single" w:color="E5E0EE" w:sz="4"/>
+            </w:tcBorders>
+            <w:shd w:fill="F1EAF9" w:val="clear"/>
+            <w:tcMar>
+              <w:top w:type="dxa" w:w="80"/>
+              <w:left w:type="dxa" w:w="100"/>
+              <w:bottom w:type="dxa" w:w="80"/>
+              <w:right w:type="dxa" w:w="100"/>
+            </w:tcMar>
+          </w:tcPr>
+          <w:p>
+            <w:pPr>
+              <w:spacing w:after="0"/>
+            </w:pPr>
+            <w:r>
+              <w:rPr>
+                <w:rFonts w:ascii="Arial" w:cs="Arial" w:eastAsia="Arial" w:hAnsi="Arial"/>
+                <w:b/>
+                <w:bCs/>
+                <w:color w:val="6B21A8"/>
+                <w:sz w:val="15"/>
+                <w:szCs w:val="15"/>
+              </w:rPr>
+              <w:t xml:space="preserve">PUBLIC LAYER</w:t>
+            </w:r>
+          </w:p>
+        </w:tc>
+      </w:tr>
+      <w:tr>
+        <w:tc>
+          <w:tcPr>
+            <w:tcW w:type="dxa" w:w="2200"/>
+            <w:tcBorders>
+              <w:top w:val="single" w:color="E5E0EE" w:sz="4"/>
+              <w:left w:val="single" w:color="E5E0EE" w:sz="4"/>
+              <w:bottom w:val="single" w:color="E5E0EE" w:sz="4"/>
+              <w:right w:val="single" w:color="E5E0EE" w:sz="4"/>
+            </w:tcBorders>
+            <w:tcMar>
+              <w:top w:type="dxa" w:w="80"/>
+              <w:left w:type="dxa" w:w="100"/>
+              <w:bottom w:type="dxa" w:w="80"/>
+              <w:right w:type="dxa" w:w="100"/>
+            </w:tcMar>
+          </w:tcPr>
+          <w:p>
+            <w:pPr>
+              <w:spacing w:after="0"/>
+            </w:pPr>
+            <w:r>
+              <w:rPr>
+                <w:sz w:val="19"/>
+                <w:szCs w:val="19"/>
+              </w:rPr>
+              <w:t xml:space="preserve">Brief transcript</w:t>
+            </w:r>
+          </w:p>
+        </w:tc>
+        <w:tc>
+          <w:tcPr>
+            <w:tcW w:type="dxa" w:w="2300"/>
+            <w:tcBorders>
+              <w:top w:val="single" w:color="E5E0EE" w:sz="4"/>
+              <w:left w:val="single" w:color="E5E0EE" w:sz="4"/>
+              <w:bottom w:val="single" w:color="E5E0EE" w:sz="4"/>
+              <w:right w:val="single" w:color="E5E0EE" w:sz="4"/>
+            </w:tcBorders>
+            <w:tcMar>
+              <w:top w:type="dxa" w:w="80"/>
+              <w:left w:type="dxa" w:w="100"/>
+              <w:bottom w:type="dxa" w:w="80"/>
+              <w:right w:type="dxa" w:w="100"/>
+            </w:tcMar>
+          </w:tcPr>
+          <w:p>
+            <w:pPr>
+              <w:spacing w:after="0"/>
+            </w:pPr>
+            <w:r>
+              <w:rPr>
+                <w:sz w:val="19"/>
+                <w:szCs w:val="19"/>
+              </w:rPr>
+              <w:t xml:space="preserve">Own only, deletable</w:t>
+            </w:r>
+          </w:p>
+        </w:tc>
+        <w:tc>
+          <w:tcPr>
+            <w:tcW w:type="dxa" w:w="2760"/>
+            <w:tcBorders>
+              <w:top w:val="single" w:color="E5E0EE" w:sz="4"/>
+              <w:left w:val="single" w:color="E5E0EE" w:sz="4"/>
+              <w:bottom w:val="single" w:color="E5E0EE" w:sz="4"/>
+              <w:right w:val="single" w:color="E5E0EE" w:sz="4"/>
+            </w:tcBorders>
+            <w:tcMar>
+              <w:top w:type="dxa" w:w="80"/>
+              <w:left w:type="dxa" w:w="100"/>
+              <w:bottom w:type="dxa" w:w="80"/>
+              <w:right w:type="dxa" w:w="100"/>
+            </w:tcMar>
+          </w:tcPr>
+          <w:p>
+            <w:pPr>
+              <w:spacing w:after="0"/>
+            </w:pPr>
+            <w:r>
+              <w:rPr>
+                <w:sz w:val="19"/>
+                <w:szCs w:val="19"/>
+              </w:rPr>
+              <w:t xml:space="preserve">Never</w:t>
+            </w:r>
+          </w:p>
+        </w:tc>
+        <w:tc>
+          <w:tcPr>
+            <w:tcW w:type="dxa" w:w="2100"/>
+            <w:tcBorders>
+              <w:top w:val="single" w:color="E5E0EE" w:sz="4"/>
+              <w:left w:val="single" w:color="E5E0EE" w:sz="4"/>
+              <w:bottom w:val="single" w:color="E5E0EE" w:sz="4"/>
+              <w:right w:val="single" w:color="E5E0EE" w:sz="4"/>
+            </w:tcBorders>
+            <w:tcMar>
+              <w:top w:type="dxa" w:w="80"/>
+              <w:left w:type="dxa" w:w="100"/>
+              <w:bottom w:type="dxa" w:w="80"/>
+              <w:right w:type="dxa" w:w="100"/>
+            </w:tcMar>
+          </w:tcPr>
+          <w:p>
+            <w:pPr>
+              <w:spacing w:after="0"/>
+            </w:pPr>
+            <w:r>
+              <w:rPr>
+                <w:sz w:val="19"/>
+                <w:szCs w:val="19"/>
+              </w:rPr>
+              <w:t xml:space="preserve">Never</w:t>
+            </w:r>
+          </w:p>
+        </w:tc>
+      </w:tr>
+      <w:tr>
+        <w:tc>
+          <w:tcPr>
+            <w:tcW w:type="dxa" w:w="2200"/>
+            <w:tcBorders>
+              <w:top w:val="single" w:color="E5E0EE" w:sz="4"/>
+              <w:left w:val="single" w:color="E5E0EE" w:sz="4"/>
+              <w:bottom w:val="single" w:color="E5E0EE" w:sz="4"/>
+              <w:right w:val="single" w:color="E5E0EE" w:sz="4"/>
+            </w:tcBorders>
+            <w:tcMar>
+              <w:top w:type="dxa" w:w="80"/>
+              <w:left w:type="dxa" w:w="100"/>
+              <w:bottom w:type="dxa" w:w="80"/>
+              <w:right w:type="dxa" w:w="100"/>
+            </w:tcMar>
+          </w:tcPr>
+          <w:p>
+            <w:pPr>
+              <w:spacing w:after="0"/>
+            </w:pPr>
+            <w:r>
+              <w:rPr>
+                <w:sz w:val="19"/>
+                <w:szCs w:val="19"/>
+              </w:rPr>
+              <w:t xml:space="preserve">Questions</w:t>
+            </w:r>
+          </w:p>
+        </w:tc>
+        <w:tc>
+          <w:tcPr>
+            <w:tcW w:type="dxa" w:w="2300"/>
+            <w:tcBorders>
+              <w:top w:val="single" w:color="E5E0EE" w:sz="4"/>
+              <w:left w:val="single" w:color="E5E0EE" w:sz="4"/>
+              <w:bottom w:val="single" w:color="E5E0EE" w:sz="4"/>
+              <w:right w:val="single" w:color="E5E0EE" w:sz="4"/>
+            </w:tcBorders>
+            <w:tcMar>
+              <w:top w:type="dxa" w:w="80"/>
+              <w:left w:type="dxa" w:w="100"/>
+              <w:bottom w:type="dxa" w:w="80"/>
+              <w:right w:type="dxa" w:w="100"/>
+            </w:tcMar>
+          </w:tcPr>
+          <w:p>
+            <w:pPr>
+              <w:spacing w:after="0"/>
+            </w:pPr>
+            <w:r>
+              <w:rPr>
+                <w:sz w:val="19"/>
+                <w:szCs w:val="19"/>
+              </w:rPr>
+              <w:t xml:space="preserve">Own; class clusters</w:t>
+            </w:r>
+          </w:p>
+        </w:tc>
+        <w:tc>
+          <w:tcPr>
+            <w:tcW w:type="dxa" w:w="2760"/>
+            <w:tcBorders>
+              <w:top w:val="single" w:color="E5E0EE" w:sz="4"/>
+              <w:left w:val="single" w:color="E5E0EE" w:sz="4"/>
+              <w:bottom w:val="single" w:color="E5E0EE" w:sz="4"/>
+              <w:right w:val="single" w:color="E5E0EE" w:sz="4"/>
+            </w:tcBorders>
+            <w:tcMar>
+              <w:top w:type="dxa" w:w="80"/>
+              <w:left w:type="dxa" w:w="100"/>
+              <w:bottom w:type="dxa" w:w="80"/>
+              <w:right w:type="dxa" w:w="100"/>
+            </w:tcMar>
+          </w:tcPr>
+          <w:p>
+            <w:pPr>
+              <w:spacing w:after="0"/>
+            </w:pPr>
+            <w:r>
+              <w:rPr>
+                <w:sz w:val="19"/>
+                <w:szCs w:val="19"/>
+              </w:rPr>
+              <w:t xml:space="preserve">Clustered phrasings, unattributed</w:t>
+            </w:r>
+          </w:p>
+        </w:tc>
+        <w:tc>
+          <w:tcPr>
+            <w:tcW w:type="dxa" w:w="2100"/>
+            <w:tcBorders>
+              <w:top w:val="single" w:color="E5E0EE" w:sz="4"/>
+              <w:left w:val="single" w:color="E5E0EE" w:sz="4"/>
+              <w:bottom w:val="single" w:color="E5E0EE" w:sz="4"/>
+              <w:right w:val="single" w:color="E5E0EE" w:sz="4"/>
+            </w:tcBorders>
+            <w:tcMar>
+              <w:top w:type="dxa" w:w="80"/>
+              <w:left w:type="dxa" w:w="100"/>
+              <w:bottom w:type="dxa" w:w="80"/>
+              <w:right w:type="dxa" w:w="100"/>
+            </w:tcMar>
+          </w:tcPr>
+          <w:p>
+            <w:pPr>
+              <w:spacing w:after="0"/>
+            </w:pPr>
+            <w:r>
+              <w:rPr>
+                <w:sz w:val="19"/>
+                <w:szCs w:val="19"/>
+              </w:rPr>
+              <w:t xml:space="preserve">Clusters, aggregated</w:t>
+            </w:r>
+          </w:p>
+        </w:tc>
+      </w:tr>
+      <w:tr>
+        <w:tc>
+          <w:tcPr>
+            <w:tcW w:type="dxa" w:w="2200"/>
+            <w:tcBorders>
+              <w:top w:val="single" w:color="E5E0EE" w:sz="4"/>
+              <w:left w:val="single" w:color="E5E0EE" w:sz="4"/>
+              <w:bottom w:val="single" w:color="E5E0EE" w:sz="4"/>
+              <w:right w:val="single" w:color="E5E0EE" w:sz="4"/>
+            </w:tcBorders>
+            <w:tcMar>
+              <w:top w:type="dxa" w:w="80"/>
+              <w:left w:type="dxa" w:w="100"/>
+              <w:bottom w:type="dxa" w:w="80"/>
+              <w:right w:type="dxa" w:w="100"/>
+            </w:tcMar>
+          </w:tcPr>
+          <w:p>
+            <w:pPr>
+              <w:spacing w:after="0"/>
+            </w:pPr>
+            <w:r>
+              <w:rPr>
+                <w:sz w:val="19"/>
+                <w:szCs w:val="19"/>
+              </w:rPr>
+              <w:t xml:space="preserve">Question credit</w:t>
+            </w:r>
+          </w:p>
+        </w:tc>
+        <w:tc>
+          <w:tcPr>
+            <w:tcW w:type="dxa" w:w="2300"/>
+            <w:tcBorders>
+              <w:top w:val="single" w:color="E5E0EE" w:sz="4"/>
+              <w:left w:val="single" w:color="E5E0EE" w:sz="4"/>
+              <w:bottom w:val="single" w:color="E5E0EE" w:sz="4"/>
+              <w:right w:val="single" w:color="E5E0EE" w:sz="4"/>
+            </w:tcBorders>
+            <w:tcMar>
+              <w:top w:type="dxa" w:w="80"/>
+              <w:left w:type="dxa" w:w="100"/>
+              <w:bottom w:type="dxa" w:w="80"/>
+              <w:right w:type="dxa" w:w="100"/>
+            </w:tcMar>
+          </w:tcPr>
+          <w:p>
+            <w:pPr>
+              <w:spacing w:after="0"/>
+            </w:pPr>
+            <w:r>
+              <w:rPr>
+                <w:sz w:val="19"/>
+                <w:szCs w:val="19"/>
+              </w:rPr>
+              <w:t xml:space="preserve">Opt-in claim when picked</w:t>
+            </w:r>
+          </w:p>
+        </w:tc>
+        <w:tc>
+          <w:tcPr>
+            <w:tcW w:type="dxa" w:w="2760"/>
+            <w:tcBorders>
+              <w:top w:val="single" w:color="E5E0EE" w:sz="4"/>
+              <w:left w:val="single" w:color="E5E0EE" w:sz="4"/>
+              <w:bottom w:val="single" w:color="E5E0EE" w:sz="4"/>
+              <w:right w:val="single" w:color="E5E0EE" w:sz="4"/>
+            </w:tcBorders>
+            <w:tcMar>
+              <w:top w:type="dxa" w:w="80"/>
+              <w:left w:type="dxa" w:w="100"/>
+              <w:bottom w:type="dxa" w:w="80"/>
+              <w:right w:type="dxa" w:w="100"/>
+            </w:tcMar>
+          </w:tcPr>
+          <w:p>
+            <w:pPr>
+              <w:spacing w:after="0"/>
+            </w:pPr>
+            <w:r>
+              <w:rPr>
+                <w:sz w:val="19"/>
+                <w:szCs w:val="19"/>
+              </w:rPr>
+              <w:t xml:space="preserve">Claimed names only</w:t>
+            </w:r>
+          </w:p>
+        </w:tc>
+        <w:tc>
+          <w:tcPr>
+            <w:tcW w:type="dxa" w:w="2100"/>
+            <w:tcBorders>
+              <w:top w:val="single" w:color="E5E0EE" w:sz="4"/>
+              <w:left w:val="single" w:color="E5E0EE" w:sz="4"/>
+              <w:bottom w:val="single" w:color="E5E0EE" w:sz="4"/>
+              <w:right w:val="single" w:color="E5E0EE" w:sz="4"/>
+            </w:tcBorders>
+            <w:tcMar>
+              <w:top w:type="dxa" w:w="80"/>
+              <w:left w:type="dxa" w:w="100"/>
+              <w:bottom w:type="dxa" w:w="80"/>
+              <w:right w:type="dxa" w:w="100"/>
+            </w:tcMar>
+          </w:tcPr>
+          <w:p>
+            <w:pPr>
+              <w:spacing w:after="0"/>
+            </w:pPr>
+            <w:r>
+              <w:rPr>
+                <w:sz w:val="19"/>
+                <w:szCs w:val="19"/>
+              </w:rPr>
+              <w:t xml:space="preserve">Never</w:t>
+            </w:r>
+          </w:p>
+        </w:tc>
+      </w:tr>
+      <w:tr>
+        <w:tc>
+          <w:tcPr>
+            <w:tcW w:type="dxa" w:w="2200"/>
+            <w:tcBorders>
+              <w:top w:val="single" w:color="E5E0EE" w:sz="4"/>
+              <w:left w:val="single" w:color="E5E0EE" w:sz="4"/>
+              <w:bottom w:val="single" w:color="E5E0EE" w:sz="4"/>
+              <w:right w:val="single" w:color="E5E0EE" w:sz="4"/>
+            </w:tcBorders>
+            <w:tcMar>
+              <w:top w:type="dxa" w:w="80"/>
+              <w:left w:type="dxa" w:w="100"/>
+              <w:bottom w:type="dxa" w:w="80"/>
+              <w:right w:type="dxa" w:w="100"/>
+            </w:tcMar>
+          </w:tcPr>
+          <w:p>
+            <w:pPr>
+              <w:spacing w:after="0"/>
+            </w:pPr>
+            <w:r>
+              <w:rPr>
+                <w:sz w:val="19"/>
+                <w:szCs w:val="19"/>
+              </w:rPr>
+              <w:t xml:space="preserve">Confusion map</w:t>
+            </w:r>
+          </w:p>
+        </w:tc>
+        <w:tc>
+          <w:tcPr>
+            <w:tcW w:type="dxa" w:w="2300"/>
+            <w:tcBorders>
+              <w:top w:val="single" w:color="E5E0EE" w:sz="4"/>
+              <w:left w:val="single" w:color="E5E0EE" w:sz="4"/>
+              <w:bottom w:val="single" w:color="E5E0EE" w:sz="4"/>
+              <w:right w:val="single" w:color="E5E0EE" w:sz="4"/>
+            </w:tcBorders>
+            <w:tcMar>
+              <w:top w:type="dxa" w:w="80"/>
+              <w:left w:type="dxa" w:w="100"/>
+              <w:bottom w:type="dxa" w:w="80"/>
+              <w:right w:type="dxa" w:w="100"/>
+            </w:tcMar>
+          </w:tcPr>
+          <w:p>
+            <w:pPr>
+              <w:spacing w:after="0"/>
+            </w:pPr>
+            <w:r>
+              <w:rPr>
+                <w:sz w:val="19"/>
+                <w:szCs w:val="19"/>
+              </w:rPr>
+              <w:t xml:space="preserve">—</w:t>
+            </w:r>
+          </w:p>
+        </w:tc>
+        <w:tc>
+          <w:tcPr>
+            <w:tcW w:type="dxa" w:w="2760"/>
+            <w:tcBorders>
+              <w:top w:val="single" w:color="E5E0EE" w:sz="4"/>
+              <w:left w:val="single" w:color="E5E0EE" w:sz="4"/>
+              <w:bottom w:val="single" w:color="E5E0EE" w:sz="4"/>
+              <w:right w:val="single" w:color="E5E0EE" w:sz="4"/>
+            </w:tcBorders>
+            <w:tcMar>
+              <w:top w:type="dxa" w:w="80"/>
+              <w:left w:type="dxa" w:w="100"/>
+              <w:bottom w:type="dxa" w:w="80"/>
+              <w:right w:type="dxa" w:w="100"/>
+            </w:tcMar>
+          </w:tcPr>
+          <w:p>
+            <w:pPr>
+              <w:spacing w:after="0"/>
+            </w:pPr>
+            <w:r>
+              <w:rPr>
+                <w:sz w:val="19"/>
+                <w:szCs w:val="19"/>
+              </w:rPr>
+              <w:t xml:space="preserve">Aggregate, k ≥ 5 only</w:t>
+            </w:r>
+          </w:p>
+        </w:tc>
+        <w:tc>
+          <w:tcPr>
+            <w:tcW w:type="dxa" w:w="2100"/>
+            <w:tcBorders>
+              <w:top w:val="single" w:color="E5E0EE" w:sz="4"/>
+              <w:left w:val="single" w:color="E5E0EE" w:sz="4"/>
+              <w:bottom w:val="single" w:color="E5E0EE" w:sz="4"/>
+              <w:right w:val="single" w:color="E5E0EE" w:sz="4"/>
+            </w:tcBorders>
+            <w:tcMar>
+              <w:top w:type="dxa" w:w="80"/>
+              <w:left w:type="dxa" w:w="100"/>
+              <w:bottom w:type="dxa" w:w="80"/>
+              <w:right w:type="dxa" w:w="100"/>
+            </w:tcMar>
+          </w:tcPr>
+          <w:p>
+            <w:pPr>
+              <w:spacing w:after="0"/>
+            </w:pPr>
+            <w:r>
+              <w:rPr>
+                <w:sz w:val="19"/>
+                <w:szCs w:val="19"/>
+              </w:rPr>
+              <w:t xml:space="preserve">Institution-anonymized</w:t>
+            </w:r>
+          </w:p>
+        </w:tc>
+      </w:tr>
+      <w:tr>
+        <w:tc>
+          <w:tcPr>
+            <w:tcW w:type="dxa" w:w="2200"/>
+            <w:tcBorders>
+              <w:top w:val="single" w:color="E5E0EE" w:sz="4"/>
+              <w:left w:val="single" w:color="E5E0EE" w:sz="4"/>
+              <w:bottom w:val="single" w:color="E5E0EE" w:sz="4"/>
+              <w:right w:val="single" w:color="E5E0EE" w:sz="4"/>
+            </w:tcBorders>
+            <w:tcMar>
+              <w:top w:type="dxa" w:w="80"/>
+              <w:left w:type="dxa" w:w="100"/>
+              <w:bottom w:type="dxa" w:w="80"/>
+              <w:right w:type="dxa" w:w="100"/>
+            </w:tcMar>
+          </w:tcPr>
+          <w:p>
+            <w:pPr>
+              <w:spacing w:after="0"/>
+            </w:pPr>
+            <w:r>
+              <w:rPr>
+                <w:sz w:val="19"/>
+                <w:szCs w:val="19"/>
+              </w:rPr>
+              <w:t xml:space="preserve">Quiz results</w:t>
+            </w:r>
+          </w:p>
+        </w:tc>
+        <w:tc>
+          <w:tcPr>
+            <w:tcW w:type="dxa" w:w="2300"/>
+            <w:tcBorders>
+              <w:top w:val="single" w:color="E5E0EE" w:sz="4"/>
+              <w:left w:val="single" w:color="E5E0EE" w:sz="4"/>
+              <w:bottom w:val="single" w:color="E5E0EE" w:sz="4"/>
+              <w:right w:val="single" w:color="E5E0EE" w:sz="4"/>
+            </w:tcBorders>
+            <w:tcMar>
+              <w:top w:type="dxa" w:w="80"/>
+              <w:left w:type="dxa" w:w="100"/>
+              <w:bottom w:type="dxa" w:w="80"/>
+              <w:right w:type="dxa" w:w="100"/>
+            </w:tcMar>
+          </w:tcPr>
+          <w:p>
+            <w:pPr>
+              <w:spacing w:after="0"/>
+            </w:pPr>
+            <w:r>
+              <w:rPr>
+                <w:sz w:val="19"/>
+                <w:szCs w:val="19"/>
+              </w:rPr>
+              <w:t xml:space="preserve">Own, private</w:t>
+            </w:r>
+          </w:p>
+        </w:tc>
+        <w:tc>
+          <w:tcPr>
+            <w:tcW w:type="dxa" w:w="2760"/>
+            <w:tcBorders>
+              <w:top w:val="single" w:color="E5E0EE" w:sz="4"/>
+              <w:left w:val="single" w:color="E5E0EE" w:sz="4"/>
+              <w:bottom w:val="single" w:color="E5E0EE" w:sz="4"/>
+              <w:right w:val="single" w:color="E5E0EE" w:sz="4"/>
+            </w:tcBorders>
+            <w:tcMar>
+              <w:top w:type="dxa" w:w="80"/>
+              <w:left w:type="dxa" w:w="100"/>
+              <w:bottom w:type="dxa" w:w="80"/>
+              <w:right w:type="dxa" w:w="100"/>
+            </w:tcMar>
+          </w:tcPr>
+          <w:p>
+            <w:pPr>
+              <w:spacing w:after="0"/>
+            </w:pPr>
+            <w:r>
+              <w:rPr>
+                <w:sz w:val="19"/>
+                <w:szCs w:val="19"/>
+              </w:rPr>
+              <w:t xml:space="preserve">Areas only — never per-student</w:t>
+            </w:r>
+          </w:p>
+        </w:tc>
+        <w:tc>
+          <w:tcPr>
+            <w:tcW w:type="dxa" w:w="2100"/>
+            <w:tcBorders>
+              <w:top w:val="single" w:color="E5E0EE" w:sz="4"/>
+              <w:left w:val="single" w:color="E5E0EE" w:sz="4"/>
+              <w:bottom w:val="single" w:color="E5E0EE" w:sz="4"/>
+              <w:right w:val="single" w:color="E5E0EE" w:sz="4"/>
+            </w:tcBorders>
+            <w:tcMar>
+              <w:top w:type="dxa" w:w="80"/>
+              <w:left w:type="dxa" w:w="100"/>
+              <w:bottom w:type="dxa" w:w="80"/>
+              <w:right w:type="dxa" w:w="100"/>
+            </w:tcMar>
+          </w:tcPr>
+          <w:p>
+            <w:pPr>
+              <w:spacing w:after="0"/>
+            </w:pPr>
+            <w:r>
+              <w:rPr>
+                <w:sz w:val="19"/>
+                <w:szCs w:val="19"/>
+              </w:rPr>
+              <w:t xml:space="preserve">Resolution rates, aggregate</w:t>
+            </w:r>
+          </w:p>
+        </w:tc>
+      </w:tr>
+    </w:tbl>
+    <w:p>
+      <w:pPr>
+        <w:spacing w:after="120"/>
+      </w:pPr>
+    </w:p>
+    <w:p>
+      <w:pPr>
+        <w:spacing w:after="160"/>
+      </w:pPr>
+      <w:r>
+        <w:rPr>
+          <w:b/>
+          <w:bCs/>
+        </w:rPr>
+        <w:t xml:space="preserve">Anonymous to the room, accountable to the system. </w:t>
+      </w:r>
+      <w:r>
+        <w:t xml:space="preserve">Students are pseudonymous on screen but identified in the backend, so a pattern of abuse is traceable and actionable. The pipeline launders most abuse out by construction: raw student text never reaches the teacher — questions are AI-distilled and clustered before display, with a moderation filter at the distillation step. Full anonymity is a free-fire zone; forced transparency is a silence machine; this is the stable point between them.</w:t>
+      </w:r>
+    </w:p>
+    <w:p>
+      <w:pPr>
+        <w:pBdr>
+          <w:left w:val="single" w:color="6B21A8" w:sz="24" w:space="4"/>
+        </w:pBdr>
+        <w:shd w:fill="F1EAF9" w:val="clear"/>
+        <w:spacing w:after="200" w:before="80"/>
+        <w:ind w:left="200"/>
+      </w:pPr>
+      <w:r>
+        <w:rPr>
+          <w:b/>
+          <w:bCs/>
+        </w:rPr>
+        <w:t xml:space="preserve">Quizzes are diagnostic, never evaluative. </w:t>
+      </w:r>
+      <w:r>
+        <w:t xml:space="preserve">No marks, no per-student reporting, no export to internal assessment. The moment results touch grades, students answer the quiz with another AI in the next tab and the signal becomes fiction.</w:t>
+      </w:r>
+    </w:p>
+    <w:p>
+      <w:pPr>
+        <w:pStyle w:val="Heading1"/>
+      </w:pPr>
+      <w:r>
         <w:t xml:space="preserve">Non-goals</w:t>
       </w:r>
     </w:p>
@@ -373,7 +1226,7 @@
         <w:t xml:space="preserve">No per-student surveillance. </w:t>
       </w:r>
       <w:r>
-        <w:t xml:space="preserve">Teachers never see transcripts or individual confusion. Students must be safe to be confused, or they will perform understanding at the AI and the data becomes theater.</w:t>
+        <w:t xml:space="preserve">Teachers never see transcripts, individual confusion, or individual quiz scores.</w:t>
       </w:r>
     </w:p>
     <w:p>
@@ -393,7 +1246,7 @@
         <w:t xml:space="preserve">No grading, proctoring, or assessment. </w:t>
       </w:r>
       <w:r>
-        <w:t xml:space="preserve">The moment this feeds marks, honest confusion disappears.</w:t>
+        <w:t xml:space="preserve">Load-bearing, not squeamishness — see above.</w:t>
       </w:r>
     </w:p>
     <w:p>
@@ -904,7 +1757,7 @@
                 <w:sz w:val="19"/>
                 <w:szCs w:val="19"/>
               </w:rPr>
-              <w:t xml:space="preserve">% of question clusters marked answered after class</w:t>
+              <w:t xml:space="preserve">% of areas marked resolved by the quiz</w:t>
             </w:r>
           </w:p>
         </w:tc>
@@ -933,7 +1786,7 @@
                 <w:sz w:val="19"/>
                 <w:szCs w:val="19"/>
               </w:rPr>
-              <w:t xml:space="preserve">Classroom absorbs the gaps</w:t>
+              <w:t xml:space="preserve">The classroom absorbs the gaps</w:t>
             </w:r>
           </w:p>
         </w:tc>
@@ -1023,6 +1876,95 @@
                 <w:szCs w:val="19"/>
               </w:rPr>
               <w:t xml:space="preserve">Pre-work stays lighter than the cramming it competes with</w:t>
+            </w:r>
+          </w:p>
+        </w:tc>
+      </w:tr>
+      <w:tr>
+        <w:tc>
+          <w:tcPr>
+            <w:tcW w:type="dxa" w:w="1700"/>
+            <w:tcBorders>
+              <w:top w:val="single" w:color="E5E0EE" w:sz="4"/>
+              <w:left w:val="single" w:color="E5E0EE" w:sz="4"/>
+              <w:bottom w:val="single" w:color="E5E0EE" w:sz="4"/>
+              <w:right w:val="single" w:color="E5E0EE" w:sz="4"/>
+            </w:tcBorders>
+            <w:tcMar>
+              <w:top w:type="dxa" w:w="80"/>
+              <w:left w:type="dxa" w:w="100"/>
+              <w:bottom w:type="dxa" w:w="80"/>
+              <w:right w:type="dxa" w:w="100"/>
+            </w:tcMar>
+          </w:tcPr>
+          <w:p>
+            <w:pPr>
+              <w:spacing w:after="0"/>
+            </w:pPr>
+            <w:r>
+              <w:rPr>
+                <w:sz w:val="19"/>
+                <w:szCs w:val="19"/>
+              </w:rPr>
+              <w:t xml:space="preserve">Guardrail</w:t>
+            </w:r>
+          </w:p>
+        </w:tc>
+        <w:tc>
+          <w:tcPr>
+            <w:tcW w:type="dxa" w:w="4300"/>
+            <w:tcBorders>
+              <w:top w:val="single" w:color="E5E0EE" w:sz="4"/>
+              <w:left w:val="single" w:color="E5E0EE" w:sz="4"/>
+              <w:bottom w:val="single" w:color="E5E0EE" w:sz="4"/>
+              <w:right w:val="single" w:color="E5E0EE" w:sz="4"/>
+            </w:tcBorders>
+            <w:tcMar>
+              <w:top w:type="dxa" w:w="80"/>
+              <w:left w:type="dxa" w:w="100"/>
+              <w:bottom w:type="dxa" w:w="80"/>
+              <w:right w:type="dxa" w:w="100"/>
+            </w:tcMar>
+          </w:tcPr>
+          <w:p>
+            <w:pPr>
+              <w:spacing w:after="0"/>
+            </w:pPr>
+            <w:r>
+              <w:rPr>
+                <w:sz w:val="19"/>
+                <w:szCs w:val="19"/>
+              </w:rPr>
+              <w:t xml:space="preserve">Quiz completion ≥ 80% when fired in class</w:t>
+            </w:r>
+          </w:p>
+        </w:tc>
+        <w:tc>
+          <w:tcPr>
+            <w:tcW w:type="dxa" w:w="3360"/>
+            <w:tcBorders>
+              <w:top w:val="single" w:color="E5E0EE" w:sz="4"/>
+              <w:left w:val="single" w:color="E5E0EE" w:sz="4"/>
+              <w:bottom w:val="single" w:color="E5E0EE" w:sz="4"/>
+              <w:right w:val="single" w:color="E5E0EE" w:sz="4"/>
+            </w:tcBorders>
+            <w:tcMar>
+              <w:top w:type="dxa" w:w="80"/>
+              <w:left w:type="dxa" w:w="100"/>
+              <w:bottom w:type="dxa" w:w="80"/>
+              <w:right w:type="dxa" w:w="100"/>
+            </w:tcMar>
+          </w:tcPr>
+          <w:p>
+            <w:pPr>
+              <w:spacing w:after="0"/>
+            </w:pPr>
+            <w:r>
+              <w:rPr>
+                <w:sz w:val="19"/>
+                <w:szCs w:val="19"/>
+              </w:rPr>
+              <w:t xml:space="preserve">The ritual holds</w:t>
             </w:r>
           </w:p>
         </w:tc>
@@ -1403,7 +2345,7 @@
                 <w:sz w:val="19"/>
                 <w:szCs w:val="19"/>
               </w:rPr>
-              <w:t xml:space="preserve">~10 classrooms via μLearn; question commons keyed to syllabus paths; confusion map productized</w:t>
+              <w:t xml:space="preserve">~10 classrooms via μLearn; full quiz loop live; question commons keyed to syllabus paths</w:t>
             </w:r>
           </w:p>
         </w:tc>
@@ -1562,6 +2504,14 @@
       <w:pPr>
         <w:spacing w:after="120"/>
       </w:pPr>
+    </w:p>
+    <w:p>
+      <w:pPr>
+        <w:spacing w:after="160"/>
+      </w:pPr>
+      <w:r>
+        <w:t xml:space="preserve">Sprint-level breakdown lives in the repo's issue backlog: epics are labels, sprints are milestones (Sprint 0–7, Aug → Dec 2026).</w:t>
+      </w:r>
     </w:p>
     <w:p>
       <w:pPr>
@@ -1896,7 +2846,7 @@
                 <w:sz w:val="19"/>
                 <w:szCs w:val="19"/>
               </w:rPr>
-              <w:t xml:space="preserve">WikiSyllabus coverage is reachable</w:t>
+              <w:t xml:space="preserve">Ungraded quizzes get taken honestly</w:t>
             </w:r>
           </w:p>
         </w:tc>
@@ -1925,7 +2875,7 @@
                 <w:sz w:val="19"/>
                 <w:szCs w:val="19"/>
               </w:rPr>
-              <w:t xml:space="preserve">Empty substrate → generic tutor</w:t>
+              <w:t xml:space="preserve">Grade pressure → AI-answered quizzes → fictional signal</w:t>
             </w:r>
           </w:p>
         </w:tc>
@@ -1954,7 +2904,7 @@
                 <w:sz w:val="19"/>
                 <w:szCs w:val="19"/>
               </w:rPr>
-              <w:t xml:space="preserve">Ship PDF→PR conversion in phase 1; measure files added per active classroom</w:t>
+              <w:t xml:space="preserve">Watch pilot completion and wrong-answer rates; a suspiciously perfect class is a red flag, not a win</w:t>
             </w:r>
           </w:p>
         </w:tc>
@@ -1985,6 +2935,95 @@
                 <w:sz w:val="19"/>
                 <w:szCs w:val="19"/>
               </w:rPr>
+              <w:t xml:space="preserve">WikiSyllabus coverage is reachable</w:t>
+            </w:r>
+          </w:p>
+        </w:tc>
+        <w:tc>
+          <w:tcPr>
+            <w:tcW w:type="dxa" w:w="2860"/>
+            <w:tcBorders>
+              <w:top w:val="single" w:color="E5E0EE" w:sz="4"/>
+              <w:left w:val="single" w:color="E5E0EE" w:sz="4"/>
+              <w:bottom w:val="single" w:color="E5E0EE" w:sz="4"/>
+              <w:right w:val="single" w:color="E5E0EE" w:sz="4"/>
+            </w:tcBorders>
+            <w:tcMar>
+              <w:top w:type="dxa" w:w="80"/>
+              <w:left w:type="dxa" w:w="100"/>
+              <w:bottom w:type="dxa" w:w="80"/>
+              <w:right w:type="dxa" w:w="100"/>
+            </w:tcMar>
+          </w:tcPr>
+          <w:p>
+            <w:pPr>
+              <w:spacing w:after="0"/>
+            </w:pPr>
+            <w:r>
+              <w:rPr>
+                <w:sz w:val="19"/>
+                <w:szCs w:val="19"/>
+              </w:rPr>
+              <w:t xml:space="preserve">Empty substrate → generic tutor</w:t>
+            </w:r>
+          </w:p>
+        </w:tc>
+        <w:tc>
+          <w:tcPr>
+            <w:tcW w:type="dxa" w:w="3800"/>
+            <w:tcBorders>
+              <w:top w:val="single" w:color="E5E0EE" w:sz="4"/>
+              <w:left w:val="single" w:color="E5E0EE" w:sz="4"/>
+              <w:bottom w:val="single" w:color="E5E0EE" w:sz="4"/>
+              <w:right w:val="single" w:color="E5E0EE" w:sz="4"/>
+            </w:tcBorders>
+            <w:tcMar>
+              <w:top w:type="dxa" w:w="80"/>
+              <w:left w:type="dxa" w:w="100"/>
+              <w:bottom w:type="dxa" w:w="80"/>
+              <w:right w:type="dxa" w:w="100"/>
+            </w:tcMar>
+          </w:tcPr>
+          <w:p>
+            <w:pPr>
+              <w:spacing w:after="0"/>
+            </w:pPr>
+            <w:r>
+              <w:rPr>
+                <w:sz w:val="19"/>
+                <w:szCs w:val="19"/>
+              </w:rPr>
+              <w:t xml:space="preserve">Ship PDF→PR conversion in phase 1; measure files added per active classroom</w:t>
+            </w:r>
+          </w:p>
+        </w:tc>
+      </w:tr>
+      <w:tr>
+        <w:tc>
+          <w:tcPr>
+            <w:tcW w:type="dxa" w:w="2700"/>
+            <w:tcBorders>
+              <w:top w:val="single" w:color="E5E0EE" w:sz="4"/>
+              <w:left w:val="single" w:color="E5E0EE" w:sz="4"/>
+              <w:bottom w:val="single" w:color="E5E0EE" w:sz="4"/>
+              <w:right w:val="single" w:color="E5E0EE" w:sz="4"/>
+            </w:tcBorders>
+            <w:tcMar>
+              <w:top w:type="dxa" w:w="80"/>
+              <w:left w:type="dxa" w:w="100"/>
+              <w:bottom w:type="dxa" w:w="80"/>
+              <w:right w:type="dxa" w:w="100"/>
+            </w:tcMar>
+          </w:tcPr>
+          <w:p>
+            <w:pPr>
+              <w:spacing w:after="0"/>
+            </w:pPr>
+            <w:r>
+              <w:rPr>
+                <w:sz w:val="19"/>
+                <w:szCs w:val="19"/>
+              </w:rPr>
               <w:t xml:space="preserve">Question quality beats what students ask unaided</w:t>
             </w:r>
           </w:p>
@@ -2072,8 +3111,8 @@
       <w:r>
         <w:rPr>
           <w:rFonts w:ascii="Consolas" w:cs="Consolas" w:eastAsia="Consolas" w:hAnsi="Consolas"/>
-          <w:sz w:val="19"/>
-          <w:szCs w:val="19"/>
+          <w:sz w:val="18"/>
+          <w:szCs w:val="18"/>
         </w:rPr>
         <w:t xml:space="preserve">syllabus_ref</w:t>
       </w:r>
@@ -2377,7 +3416,7 @@
                 <w:sz w:val="19"/>
                 <w:szCs w:val="19"/>
               </w:rPr>
-              <w:t xml:space="preserve">Institution, timetable, roster size. No student identities beyond auth</w:t>
+              <w:t xml:space="preserve">Institution, roster size. No student identities beyond auth</w:t>
             </w:r>
           </w:p>
         </w:tc>
@@ -2438,7 +3477,7 @@
                 <w:sz w:val="19"/>
                 <w:szCs w:val="19"/>
               </w:rPr>
-              <w:t xml:space="preserve">classroom + module + slot</w:t>
+              <w:t xml:space="preserve">classroom + module + push</w:t>
             </w:r>
           </w:p>
         </w:tc>
@@ -2467,7 +3506,7 @@
                 <w:sz w:val="19"/>
                 <w:szCs w:val="19"/>
               </w:rPr>
-              <w:t xml:space="preserve">The pre-class assignment; content hash of the generated brief</w:t>
+              <w:t xml:space="preserve">The pushed topic; content hash of the generated brief</w:t>
             </w:r>
           </w:p>
         </w:tc>
@@ -2647,7 +3686,7 @@
                 <w:sz w:val="19"/>
                 <w:szCs w:val="19"/>
               </w:rPr>
-              <w:t xml:space="preserve">Text, pseudonymous author, cluster id, votes; status drafted → asked → answered | partial | unanswered</w:t>
+              <w:t xml:space="preserve">Text, pseudonymous author, cluster id, claim status; drafted → asked → answered | partial | unanswered</w:t>
             </w:r>
           </w:p>
         </w:tc>
@@ -2679,7 +3718,7 @@
                 <w:sz w:val="18"/>
                 <w:szCs w:val="18"/>
               </w:rPr>
-              <w:t xml:space="preserve">confusion_map</w:t>
+              <w:t xml:space="preserve">quiz</w:t>
             </w:r>
           </w:p>
         </w:tc>
@@ -2737,7 +3776,7 @@
                 <w:sz w:val="19"/>
                 <w:szCs w:val="19"/>
               </w:rPr>
-              <w:t xml:space="preserve">Aggregate: understood topics, confused topics, top clusters. Renders only at k ≥ 5 participants</w:t>
+              <w:t xml:space="preserve">Generated items (area + source cluster), veto record, delivery mode</w:t>
             </w:r>
           </w:p>
         </w:tc>
@@ -2769,7 +3808,7 @@
                 <w:sz w:val="18"/>
                 <w:szCs w:val="18"/>
               </w:rPr>
-              <w:t xml:space="preserve">misconception</w:t>
+              <w:t xml:space="preserve">quiz_result</w:t>
             </w:r>
           </w:p>
         </w:tc>
@@ -2798,7 +3837,7 @@
                 <w:sz w:val="19"/>
                 <w:szCs w:val="19"/>
               </w:rPr>
-              <w:t xml:space="preserve">module + cluster</w:t>
+              <w:t xml:space="preserve">session (aggregate)</w:t>
             </w:r>
           </w:p>
         </w:tc>
@@ -2827,7 +3866,7 @@
                 <w:sz w:val="19"/>
                 <w:szCs w:val="19"/>
               </w:rPr>
-              <w:t xml:space="preserve">Recurring wrong mental model; evidence count, classroom count</w:t>
+              <w:t xml:space="preserve">Per-area resolved | partial | unresolved. No per-student row ever leaves the student's own view</w:t>
             </w:r>
           </w:p>
         </w:tc>
@@ -2859,6 +3898,186 @@
                 <w:sz w:val="18"/>
                 <w:szCs w:val="18"/>
               </w:rPr>
+              <w:t xml:space="preserve">confusion_map</w:t>
+            </w:r>
+          </w:p>
+        </w:tc>
+        <w:tc>
+          <w:tcPr>
+            <w:tcW w:type="dxa" w:w="2400"/>
+            <w:tcBorders>
+              <w:top w:val="single" w:color="E5E0EE" w:sz="4"/>
+              <w:left w:val="single" w:color="E5E0EE" w:sz="4"/>
+              <w:bottom w:val="single" w:color="E5E0EE" w:sz="4"/>
+              <w:right w:val="single" w:color="E5E0EE" w:sz="4"/>
+            </w:tcBorders>
+            <w:tcMar>
+              <w:top w:type="dxa" w:w="80"/>
+              <w:left w:type="dxa" w:w="100"/>
+              <w:bottom w:type="dxa" w:w="80"/>
+              <w:right w:type="dxa" w:w="100"/>
+            </w:tcMar>
+          </w:tcPr>
+          <w:p>
+            <w:pPr>
+              <w:spacing w:after="0"/>
+            </w:pPr>
+            <w:r>
+              <w:rPr>
+                <w:sz w:val="19"/>
+                <w:szCs w:val="19"/>
+              </w:rPr>
+              <w:t xml:space="preserve">session</w:t>
+            </w:r>
+          </w:p>
+        </w:tc>
+        <w:tc>
+          <w:tcPr>
+            <w:tcW w:type="dxa" w:w="4960"/>
+            <w:tcBorders>
+              <w:top w:val="single" w:color="E5E0EE" w:sz="4"/>
+              <w:left w:val="single" w:color="E5E0EE" w:sz="4"/>
+              <w:bottom w:val="single" w:color="E5E0EE" w:sz="4"/>
+              <w:right w:val="single" w:color="E5E0EE" w:sz="4"/>
+            </w:tcBorders>
+            <w:tcMar>
+              <w:top w:type="dxa" w:w="80"/>
+              <w:left w:type="dxa" w:w="100"/>
+              <w:bottom w:type="dxa" w:w="80"/>
+              <w:right w:type="dxa" w:w="100"/>
+            </w:tcMar>
+          </w:tcPr>
+          <w:p>
+            <w:pPr>
+              <w:spacing w:after="0"/>
+            </w:pPr>
+            <w:r>
+              <w:rPr>
+                <w:sz w:val="19"/>
+                <w:szCs w:val="19"/>
+              </w:rPr>
+              <w:t xml:space="preserve">Aggregate: understood topics, confused topics, top clusters. Renders only at k ≥ 5 participants</w:t>
+            </w:r>
+          </w:p>
+        </w:tc>
+      </w:tr>
+      <w:tr>
+        <w:tc>
+          <w:tcPr>
+            <w:tcW w:type="dxa" w:w="2000"/>
+            <w:tcBorders>
+              <w:top w:val="single" w:color="E5E0EE" w:sz="4"/>
+              <w:left w:val="single" w:color="E5E0EE" w:sz="4"/>
+              <w:bottom w:val="single" w:color="E5E0EE" w:sz="4"/>
+              <w:right w:val="single" w:color="E5E0EE" w:sz="4"/>
+            </w:tcBorders>
+            <w:tcMar>
+              <w:top w:type="dxa" w:w="80"/>
+              <w:left w:type="dxa" w:w="100"/>
+              <w:bottom w:type="dxa" w:w="80"/>
+              <w:right w:type="dxa" w:w="100"/>
+            </w:tcMar>
+          </w:tcPr>
+          <w:p>
+            <w:pPr>
+              <w:spacing w:after="0"/>
+            </w:pPr>
+            <w:r>
+              <w:rPr>
+                <w:rFonts w:ascii="Consolas" w:cs="Consolas" w:eastAsia="Consolas" w:hAnsi="Consolas"/>
+                <w:sz w:val="18"/>
+                <w:szCs w:val="18"/>
+              </w:rPr>
+              <w:t xml:space="preserve">misconception</w:t>
+            </w:r>
+          </w:p>
+        </w:tc>
+        <w:tc>
+          <w:tcPr>
+            <w:tcW w:type="dxa" w:w="2400"/>
+            <w:tcBorders>
+              <w:top w:val="single" w:color="E5E0EE" w:sz="4"/>
+              <w:left w:val="single" w:color="E5E0EE" w:sz="4"/>
+              <w:bottom w:val="single" w:color="E5E0EE" w:sz="4"/>
+              <w:right w:val="single" w:color="E5E0EE" w:sz="4"/>
+            </w:tcBorders>
+            <w:tcMar>
+              <w:top w:type="dxa" w:w="80"/>
+              <w:left w:type="dxa" w:w="100"/>
+              <w:bottom w:type="dxa" w:w="80"/>
+              <w:right w:type="dxa" w:w="100"/>
+            </w:tcMar>
+          </w:tcPr>
+          <w:p>
+            <w:pPr>
+              <w:spacing w:after="0"/>
+            </w:pPr>
+            <w:r>
+              <w:rPr>
+                <w:sz w:val="19"/>
+                <w:szCs w:val="19"/>
+              </w:rPr>
+              <w:t xml:space="preserve">module + cluster</w:t>
+            </w:r>
+          </w:p>
+        </w:tc>
+        <w:tc>
+          <w:tcPr>
+            <w:tcW w:type="dxa" w:w="4960"/>
+            <w:tcBorders>
+              <w:top w:val="single" w:color="E5E0EE" w:sz="4"/>
+              <w:left w:val="single" w:color="E5E0EE" w:sz="4"/>
+              <w:bottom w:val="single" w:color="E5E0EE" w:sz="4"/>
+              <w:right w:val="single" w:color="E5E0EE" w:sz="4"/>
+            </w:tcBorders>
+            <w:tcMar>
+              <w:top w:type="dxa" w:w="80"/>
+              <w:left w:type="dxa" w:w="100"/>
+              <w:bottom w:type="dxa" w:w="80"/>
+              <w:right w:type="dxa" w:w="100"/>
+            </w:tcMar>
+          </w:tcPr>
+          <w:p>
+            <w:pPr>
+              <w:spacing w:after="0"/>
+            </w:pPr>
+            <w:r>
+              <w:rPr>
+                <w:sz w:val="19"/>
+                <w:szCs w:val="19"/>
+              </w:rPr>
+              <w:t xml:space="preserve">Recurring wrong mental model; evidence count, classroom count</w:t>
+            </w:r>
+          </w:p>
+        </w:tc>
+      </w:tr>
+      <w:tr>
+        <w:tc>
+          <w:tcPr>
+            <w:tcW w:type="dxa" w:w="2000"/>
+            <w:tcBorders>
+              <w:top w:val="single" w:color="E5E0EE" w:sz="4"/>
+              <w:left w:val="single" w:color="E5E0EE" w:sz="4"/>
+              <w:bottom w:val="single" w:color="E5E0EE" w:sz="4"/>
+              <w:right w:val="single" w:color="E5E0EE" w:sz="4"/>
+            </w:tcBorders>
+            <w:tcMar>
+              <w:top w:type="dxa" w:w="80"/>
+              <w:left w:type="dxa" w:w="100"/>
+              <w:bottom w:type="dxa" w:w="80"/>
+              <w:right w:type="dxa" w:w="100"/>
+            </w:tcMar>
+          </w:tcPr>
+          <w:p>
+            <w:pPr>
+              <w:spacing w:after="0"/>
+            </w:pPr>
+            <w:r>
+              <w:rPr>
+                <w:rFonts w:ascii="Consolas" w:cs="Consolas" w:eastAsia="Consolas" w:hAnsi="Consolas"/>
+                <w:sz w:val="18"/>
+                <w:szCs w:val="18"/>
+              </w:rPr>
               <w:t xml:space="preserve">gap_record</w:t>
             </w:r>
           </w:p>
@@ -2971,7 +4190,7 @@
           <w:sz w:val="17"/>
           <w:szCs w:val="17"/>
         </w:rPr>
-        <w:t xml:space="preserve">├── questions.yaml        # clustered, with in-class outcomes</w:t>
+        <w:t xml:space="preserve">├── questions.yaml        # clustered, with in-class + quiz outcomes</w:t>
       </w:r>
     </w:p>
     <w:p>
@@ -3182,6 +4401,21 @@
           <w:szCs w:val="17"/>
         </w:rPr>
         <w:t xml:space="preserve">    in_class: { answered: 23, partial: 9, unanswered: 9 }</w:t>
+      </w:r>
+    </w:p>
+    <w:p>
+      <w:pPr>
+        <w:shd w:fill="F3F0FA" w:val="clear"/>
+        <w:spacing w:after="0" w:line="264" w:lineRule="auto"/>
+        <w:ind w:left="240" w:right="240"/>
+      </w:pPr>
+      <w:r>
+        <w:rPr>
+          <w:rFonts w:ascii="Consolas" w:cs="Consolas" w:eastAsia="Consolas" w:hAnsi="Consolas"/>
+          <w:sz w:val="17"/>
+          <w:szCs w:val="17"/>
+        </w:rPr>
+        <w:t xml:space="preserve">    quiz_resolution: { resolved: 5, partial: 1, unresolved: 1 }</w:t>
       </w:r>
     </w:p>
     <w:p>
@@ -3292,6 +4526,59 @@
       </w:r>
       <w:r>
         <w:t xml:space="preserve">Teachers see aggregates, never transcripts. Nothing renders below five participants. The public layer strips institution identity until a college opts in. Students own their interaction history and can delete it.</w:t>
+      </w:r>
+    </w:p>
+    <w:p>
+      <w:pPr>
+        <w:pStyle w:val="Heading1"/>
+      </w:pPr>
+      <w:r>
+        <w:t xml:space="preserve">Built to last</w:t>
+      </w:r>
+    </w:p>
+    <w:p>
+      <w:pPr>
+        <w:spacing w:after="160"/>
+      </w:pPr>
+      <w:r>
+        <w:rPr>
+          <w:b/>
+          <w:bCs/>
+        </w:rPr>
+        <w:t xml:space="preserve">Engineering: </w:t>
+      </w:r>
+      <w:r>
+        <w:t xml:space="preserve">a pure domain core with ports for everything external (syllabus source, LLM, clustering, messaging, commons publishing) and adapters at the edge — SOLID mapped concretely, with the core's framework-independence enforced by CI. See docs/ARCHITECTURE.md in the repo.</w:t>
+      </w:r>
+    </w:p>
+    <w:p>
+      <w:pPr>
+        <w:spacing w:after="160"/>
+      </w:pPr>
+      <w:r>
+        <w:rPr>
+          <w:b/>
+          <w:bCs/>
+        </w:rPr>
+        <w:t xml:space="preserve">UX: </w:t>
+      </w:r>
+      <w:r>
+        <w:t xml:space="preserve">every screen passes the hallway test — a stranger completes the core action unaided, first try, under a minute. One primary action per screen, classroom language over system language, empty states that teach. See docs/UX-PRINCIPLES.md.</w:t>
+      </w:r>
+    </w:p>
+    <w:p>
+      <w:pPr>
+        <w:spacing w:after="160"/>
+      </w:pPr>
+      <w:r>
+        <w:rPr>
+          <w:b/>
+          <w:bCs/>
+        </w:rPr>
+        <w:t xml:space="preserve">Process: </w:t>
+      </w:r>
+      <w:r>
+        <w:t xml:space="preserve">the backlog is epics-as-labels and sprints-as-milestones (Sprint 0–7, Aug → Dec 2026), and every stage of the cycle names the Claude skill that runs it — planning, design, review, QA, shipping, retro. See docs/PLAYBOOK.md and the issue backlog at github.com/deepusnath/living-syllabus.</w:t>
       </w:r>
     </w:p>
     <w:sectPr>

</xml_diff>